<commit_message>
fix: resolve referencde errors in Navbar and Hero pruebasssssssssdssadasdgg
</commit_message>
<xml_diff>
--- a/Claude outputs/Contrato_Domina_Google_PLANTILLA.docx
+++ b/Claude outputs/Contrato_Domina_Google_PLANTILLA.docx
@@ -897,14 +897,6 @@
         <w:spacing w:after="200"/>
       </w:pPr>
       <w:r>
-        <w:t xml:space="preserve">Concluido el periodo de lanzamiento o agotado el cupo, el precio regular del servicio es de $13,000 MXN.</w:t>
-      </w:r>
-    </w:p>
-    <w:p>
-      <w:pPr>
-        <w:spacing w:after="200"/>
-      </w:pPr>
-      <w:r>
         <w:t xml:space="preserve">“EL CLIENTE” pagará a “EL PRESTADOR” la cantidad correspondiente al nivel vigente al momento de la firma, señalada como: </w:t>
       </w:r>
       <w:r>
@@ -1004,7 +996,7 @@
         <w:spacing w:after="200"/>
       </w:pPr>
       <w:r>
-        <w:t xml:space="preserve">Los pagos se realizarán mediante transferencia electrónica a la siguiente cuenta:</w:t>
+        <w:t>Los pagos se realizarán en efectivo, contra recibo firmado por “EL PRESTADOR”, o mediante transferencia electrónica a la siguiente cuenta:</w:t>
       </w:r>
     </w:p>
     <w:p>
@@ -1115,7 +1107,7 @@
         <w:t xml:space="preserve">2. </w:t>
       </w:r>
       <w:r>
-        <w:t xml:space="preserve">Pago del anticipo por parte de “EL CLIENTE”, conforme a los datos bancarios señalados.</w:t>
+        <w:t>Pago del anticipo por parte de “EL CLIENTE”, en efectivo o conforme a los datos bancarios señalados.</w:t>
       </w:r>
     </w:p>
     <w:p>
@@ -1131,7 +1123,7 @@
         <w:t xml:space="preserve">3. </w:t>
       </w:r>
       <w:r>
-        <w:t xml:space="preserve">Envío del comprobante de pago (transferencia o depósito) por parte de “EL CLIENTE” a “EL PRESTADOR”.</w:t>
+        <w:t>Envío del comprobante de pago (transferencia o depósito) por parte de “EL CLIENTE” a “EL PRESTADOR”, o entrega del recibo firmado por “EL PRESTADOR” si el pago fue en efectivo.</w:t>
       </w:r>
     </w:p>
     <w:p>

</xml_diff>